<commit_message>
Guide: only Rishav's account remains besides the admin
Co-Authored-By: Claude Opus 5.5 <noreply@anthropic.com>
</commit_message>
<xml_diff>
--- a/docs/Keepup-Complete-Guide.docx
+++ b/docs/Keepup-Complete-Guide.docx
@@ -1805,19 +1805,19 @@
         <w:rPr>
           <w:b w:val="0"/>
         </w:rPr>
-        <w:t xml:space="preserve">The three accounts already in Keepup (Soumya, Rishav, and the "codex" test account) are </w:t>
+        <w:t xml:space="preserve">Rishav's account, already in Keepup, is a </w:t>
       </w:r>
       <w:r>
         <w:rPr>
           <w:b/>
         </w:rPr>
-        <w:t>members</w:t>
+        <w:t>member</w:t>
       </w:r>
       <w:r>
         <w:rPr>
           <w:b w:val="0"/>
         </w:rPr>
-        <w:t xml:space="preserve"> who can't see anyone yet. Each of them will be asked for their name the next time they sign in.</w:t>
+        <w:t xml:space="preserve"> who can't see anyone yet. He'll be asked for his name the next time he signs in.</w:t>
       </w:r>
     </w:p>
     <w:p>

</xml_diff>

<commit_message>
Guides: company version is live; rollout switch removed (016 applied); privacy test updated
Co-Authored-By: Claude Opus 5.5 <noreply@anthropic.com>
</commit_message>
<xml_diff>
--- a/docs/Keepup-Complete-Guide.docx
+++ b/docs/Keepup-Complete-Guide.docx
@@ -1729,7 +1729,7 @@
           <w:color w:val="257EF4"/>
           <w:sz w:val="28"/>
         </w:rPr>
-        <w:t>Going live (not done yet)</w:t>
+        <w:t>Status: live</w:t>
       </w:r>
     </w:p>
     <w:p>
@@ -1737,19 +1737,64 @@
         <w:rPr>
           <w:b w:val="0"/>
         </w:rPr>
-        <w:t xml:space="preserve">The database and server functions are already updated. They were made so that </w:t>
+        <w:t xml:space="preserve">The company version has been live on </w:t>
       </w:r>
       <w:r>
         <w:rPr>
           <w:b/>
         </w:rPr>
-        <w:t>the live site keeps working exactly as before</w:t>
+        <w:t>keepup.devdeepsaha.in</w:t>
       </w:r>
       <w:r>
         <w:rPr>
           <w:b w:val="0"/>
         </w:rPr>
-        <w:t>: colleagues' work is only shared with this new version of the app. To launch:</w:t>
+        <w:t xml:space="preserve"> since October 12, 2026.</w:t>
+      </w:r>
+    </w:p>
+    <w:p>
+      <w:pPr>
+        <w:pStyle w:val="ListBullet"/>
+      </w:pPr>
+      <w:r>
+        <w:rPr>
+          <w:b w:val="0"/>
+        </w:rPr>
+        <w:t xml:space="preserve">The database sharing rules, the </w:t>
+      </w:r>
+      <w:r>
+        <w:rPr>
+          <w:rFonts w:ascii="Consolas" w:hAnsi="Consolas"/>
+          <w:b w:val="0"/>
+          <w:color w:val="1E5FC0"/>
+          <w:sz w:val="19"/>
+        </w:rPr>
+        <w:t>org</w:t>
+      </w:r>
+      <w:r>
+        <w:rPr>
+          <w:b w:val="0"/>
+        </w:rPr>
+        <w:t xml:space="preserve"> server function and Bouncy's team mode are all running.</w:t>
+      </w:r>
+    </w:p>
+    <w:p>
+      <w:pPr>
+        <w:pStyle w:val="ListBullet"/>
+      </w:pPr>
+      <w:r>
+        <w:rPr>
+          <w:b w:val="0"/>
+        </w:rPr>
+        <w:t>The privacy test passed all 47 checks again after launch.</w:t>
+      </w:r>
+    </w:p>
+    <w:p>
+      <w:r>
+        <w:rPr>
+          <w:b w:val="0"/>
+        </w:rPr>
+        <w:t>Next steps for the admin:</w:t>
       </w:r>
     </w:p>
     <w:p>
@@ -1760,7 +1805,19 @@
         <w:rPr>
           <w:b w:val="0"/>
         </w:rPr>
-        <w:t>Say "push". The new app goes to GitHub and Vercel deploys it to keepup.devdeepsaha.in.</w:t>
+        <w:t xml:space="preserve">Open </w:t>
+      </w:r>
+      <w:r>
+        <w:rPr>
+          <w:b/>
+        </w:rPr>
+        <w:t>Admin</w:t>
+      </w:r>
+      <w:r>
+        <w:rPr>
+          <w:b w:val="0"/>
+        </w:rPr>
+        <w:t xml:space="preserve"> and set roles: who is a founder, who is a manager.</w:t>
       </w:r>
     </w:p>
     <w:p>
@@ -1771,22 +1828,19 @@
         <w:rPr>
           <w:b w:val="0"/>
         </w:rPr>
-        <w:t xml:space="preserve">Then I apply </w:t>
+        <w:t xml:space="preserve">In </w:t>
       </w:r>
       <w:r>
         <w:rPr>
-          <w:rFonts w:ascii="Consolas" w:hAnsi="Consolas"/>
-          <w:b w:val="0"/>
-          <w:color w:val="1E5FC0"/>
-          <w:sz w:val="19"/>
+          <w:b/>
         </w:rPr>
-        <w:t>016_org_live.sql</w:t>
+        <w:t>Who sees whom</w:t>
       </w:r>
       <w:r>
         <w:rPr>
           <w:b w:val="0"/>
         </w:rPr>
-        <w:t>, which removes that temporary safety switch.</w:t>
+        <w:t>, give each founder their people.</w:t>
       </w:r>
     </w:p>
     <w:p>
@@ -1797,7 +1851,30 @@
         <w:rPr>
           <w:b w:val="0"/>
         </w:rPr>
-        <w:t>Set roles and access in Admin, then invite people a few at a time.</w:t>
+        <w:t>Invite everyone, a few at a time (the email limit is a few per hour).</w:t>
+      </w:r>
+    </w:p>
+    <w:p>
+      <w:pPr>
+        <w:pStyle w:val="ListNumber"/>
+      </w:pPr>
+      <w:r>
+        <w:rPr>
+          <w:b w:val="0"/>
+        </w:rPr>
+        <w:t xml:space="preserve">Hand out the </w:t>
+      </w:r>
+      <w:r>
+        <w:rPr>
+          <w:b/>
+        </w:rPr>
+        <w:t>Keepup employee guide</w:t>
+      </w:r>
+      <w:r>
+        <w:rPr>
+          <w:b w:val="0"/>
+        </w:rPr>
+        <w:t xml:space="preserve"> so everyone knows how it works.</w:t>
       </w:r>
     </w:p>
     <w:p>
@@ -1805,19 +1882,7 @@
         <w:rPr>
           <w:b w:val="0"/>
         </w:rPr>
-        <w:t xml:space="preserve">Rishav's account, already in Keepup, is a </w:t>
-      </w:r>
-      <w:r>
-        <w:rPr>
-          <w:b/>
-        </w:rPr>
-        <w:t>member</w:t>
-      </w:r>
-      <w:r>
-        <w:rPr>
-          <w:b w:val="0"/>
-        </w:rPr>
-        <w:t xml:space="preserve"> who can't see anyone yet. They'll be asked for their name the next time he signs in.</w:t>
+        <w:t>Right now Keepup has two accounts: Devdeep (Admin, Founder, Member) and Rishav (Member). Rishav will be asked for a name the next time they sign in.</w:t>
       </w:r>
     </w:p>
     <w:p>
@@ -3155,7 +3220,7 @@
           <w:color w:val="257EF4"/>
           <w:sz w:val="28"/>
         </w:rPr>
-        <w:t>Rollout safety switch</w:t>
+        <w:t>Rollout history</w:t>
       </w:r>
     </w:p>
     <w:p>
@@ -3164,9 +3229,15 @@
       </w:pPr>
       <w:r>
         <w:rPr>
+          <w:b/>
+        </w:rPr>
+        <w:t>Before launch:</w:t>
+      </w:r>
+      <w:r>
+        <w:rPr>
           <w:b w:val="0"/>
         </w:rPr>
-        <w:t xml:space="preserve">Until the new app is live, shared rows only reach requests carrying the header </w:t>
+        <w:t xml:space="preserve"> shared rows only reached requests carrying the header </w:t>
       </w:r>
       <w:r>
         <w:rPr>
@@ -3181,7 +3252,7 @@
         <w:rPr>
           <w:b w:val="0"/>
         </w:rPr>
-        <w:t>, which only the new app sends. The current live site therefore behaves exactly as before. Bouncy's team view is switched on the same way.</w:t>
+        <w:t>, which only the new app sends, so the old live site kept working unchanged.</w:t>
       </w:r>
     </w:p>
     <w:p>
@@ -3190,9 +3261,15 @@
       </w:pPr>
       <w:r>
         <w:rPr>
+          <w:b/>
+        </w:rPr>
+        <w:t>At launch (Oct 12, 2026):</w:t>
+      </w:r>
+      <w:r>
+        <w:rPr>
           <w:b w:val="0"/>
         </w:rPr>
-        <w:t xml:space="preserve">After the push, migration </w:t>
+        <w:t xml:space="preserve"> after Vercel deployed the new app, migration </w:t>
       </w:r>
       <w:r>
         <w:rPr>
@@ -3207,7 +3284,39 @@
         <w:rPr>
           <w:b w:val="0"/>
         </w:rPr>
-        <w:t xml:space="preserve"> removes the switch.</w:t>
+        <w:t xml:space="preserve"> removed that switch. The sharing rules now apply to every request.</w:t>
+      </w:r>
+    </w:p>
+    <w:p>
+      <w:pPr>
+        <w:pStyle w:val="ListBullet"/>
+      </w:pPr>
+      <w:r>
+        <w:rPr>
+          <w:b/>
+        </w:rPr>
+        <w:t>Still in place:</w:t>
+      </w:r>
+      <w:r>
+        <w:rPr>
+          <w:b w:val="0"/>
+        </w:rPr>
+        <w:t xml:space="preserve"> Bouncy's team view only loads for requests from the app (which sends </w:t>
+      </w:r>
+      <w:r>
+        <w:rPr>
+          <w:rFonts w:ascii="Consolas" w:hAnsi="Consolas"/>
+          <w:b w:val="0"/>
+          <w:color w:val="1E5FC0"/>
+          <w:sz w:val="19"/>
+        </w:rPr>
+        <w:t>x-keepup-org: 1</w:t>
+      </w:r>
+      <w:r>
+        <w:rPr>
+          <w:b w:val="0"/>
+        </w:rPr>
+        <w:t>).</w:t>
       </w:r>
     </w:p>
     <w:p>
@@ -3392,7 +3501,7 @@
               <w:rPr>
                 <w:b w:val="0"/>
               </w:rPr>
-              <w:t>Removes the rollout switch (apply after the push)</w:t>
+              <w:t>Removed the rollout switch (applied at launch)</w:t>
             </w:r>
           </w:p>
         </w:tc>

</xml_diff>

<commit_message>
Phones: clear Add button and due-date chip, visible ⋯ menu, hover-only controls shown on touch, Bouncy Enter = new line with a send button; on hold moves and shrinks at once; access by Everyone / Teams / Exceptions (017) with 62-check privacy test; guides updated
Co-Authored-By: Claude Opus 5.5 <noreply@anthropic.com>
</commit_message>
<xml_diff>
--- a/docs/Keepup-Complete-Guide.docx
+++ b/docs/Keepup-Complete-Guide.docx
@@ -741,11 +741,116 @@
       </w:r>
     </w:p>
     <w:p>
+      <w:pPr>
+        <w:keepNext/>
+        <w:spacing w:before="240" w:after="80"/>
+      </w:pPr>
+      <w:r>
+        <w:rPr>
+          <w:b/>
+          <w:color w:val="222222"/>
+          <w:sz w:val="24"/>
+        </w:rPr>
+        <w:t>Who sees whom: Everyone, Teams, Exceptions</w:t>
+      </w:r>
+    </w:p>
+    <w:p>
       <w:r>
         <w:rPr>
           <w:b w:val="0"/>
         </w:rPr>
-        <w:t xml:space="preserve">A founder can only pass on what they have themselves. If the admin gave a founder </w:t>
+        <w:t>You don't set access one person at a time. For each founder or manager there are three layers:</w:t>
+      </w:r>
+    </w:p>
+    <w:p>
+      <w:pPr>
+        <w:pStyle w:val="ListNumber"/>
+      </w:pPr>
+      <w:r>
+        <w:rPr>
+          <w:b/>
+        </w:rPr>
+        <w:t>Everyone:</w:t>
+      </w:r>
+      <w:r>
+        <w:rPr>
+          <w:b w:val="0"/>
+        </w:rPr>
+        <w:t xml:space="preserve"> None, View or Plan for the whole company, including people who join later. It never includes the</w:t>
+      </w:r>
+    </w:p>
+    <w:p>
+      <w:r>
+        <w:rPr>
+          <w:b w:val="0"/>
+        </w:rPr>
+        <w:t>admin. For a manager set up by a founder, it means everyone that founder can see.</w:t>
+      </w:r>
+    </w:p>
+    <w:p>
+      <w:pPr>
+        <w:pStyle w:val="ListNumber"/>
+      </w:pPr>
+      <w:r>
+        <w:rPr>
+          <w:b/>
+        </w:rPr>
+        <w:t>Teams:</w:t>
+      </w:r>
+      <w:r>
+        <w:rPr>
+          <w:b w:val="0"/>
+        </w:rPr>
+        <w:t xml:space="preserve"> groups the admin makes (Design, Dev, Content…). Give a founder or manager a whole team at View or Plan.</w:t>
+      </w:r>
+    </w:p>
+    <w:p>
+      <w:r>
+        <w:rPr>
+          <w:b w:val="0"/>
+        </w:rPr>
+        <w:t>Adding someone to a team gives them access straight away.</w:t>
+      </w:r>
+    </w:p>
+    <w:p>
+      <w:pPr>
+        <w:pStyle w:val="ListNumber"/>
+      </w:pPr>
+      <w:r>
+        <w:rPr>
+          <w:b/>
+        </w:rPr>
+        <w:t>Exceptions:</w:t>
+      </w:r>
+      <w:r>
+        <w:rPr>
+          <w:b w:val="0"/>
+        </w:rPr>
+        <w:t xml:space="preserve"> single people that override the layers above, for example "Everyone except Rahul" (Hide this</w:t>
+      </w:r>
+    </w:p>
+    <w:p>
+      <w:r>
+        <w:rPr>
+          <w:b w:val="0"/>
+        </w:rPr>
+        <w:t>person), or Plan for one person on a View-only team.</w:t>
+      </w:r>
+    </w:p>
+    <w:p>
+      <w:r>
+        <w:rPr>
+          <w:b w:val="0"/>
+        </w:rPr>
+        <w:t>The most specific layer wins: an exception, then the best team, then Everyone. A summary at the top shows who that person ends up seeing.</w:t>
+      </w:r>
+    </w:p>
+    <w:p>
+      <w:r>
+        <w:rPr>
+          <w:b w:val="0"/>
+        </w:rPr>
+        <w:t xml:space="preserve">A founder can never give a manager more than the founder has. If the founder can only </w:t>
       </w:r>
       <w:r>
         <w:rPr>
@@ -757,31 +862,7 @@
         <w:rPr>
           <w:b w:val="0"/>
         </w:rPr>
-        <w:t xml:space="preserve"> of Rahul, that founder can give a manager </w:t>
-      </w:r>
-      <w:r>
-        <w:rPr>
-          <w:b/>
-        </w:rPr>
-        <w:t>View</w:t>
-      </w:r>
-      <w:r>
-        <w:rPr>
-          <w:b w:val="0"/>
-        </w:rPr>
-        <w:t xml:space="preserve"> of Rahul, but not </w:t>
-      </w:r>
-      <w:r>
-        <w:rPr>
-          <w:b/>
-        </w:rPr>
-        <w:t>Plan</w:t>
-      </w:r>
-      <w:r>
-        <w:rPr>
-          <w:b w:val="0"/>
-        </w:rPr>
-        <w:t>.</w:t>
+        <w:t xml:space="preserve"> Rahul, their manager gets at most View of Rahul, even with "Everyone at Plan".</w:t>
       </w:r>
     </w:p>
     <w:p>
@@ -898,7 +979,36 @@
         <w:rPr>
           <w:b w:val="0"/>
         </w:rPr>
-        <w:t xml:space="preserve"> pick a founder or manager, then choose None, View or Plan for each person.</w:t>
+        <w:t xml:space="preserve"> pick a founder or manager, then set Everyone, Teams and Exceptions (see above).</w:t>
+      </w:r>
+    </w:p>
+    <w:p>
+      <w:pPr>
+        <w:pStyle w:val="ListNumber"/>
+      </w:pPr>
+      <w:r>
+        <w:rPr>
+          <w:b/>
+        </w:rPr>
+        <w:t>Teams:</w:t>
+      </w:r>
+      <w:r>
+        <w:rPr>
+          <w:b w:val="0"/>
+        </w:rPr>
+        <w:t xml:space="preserve"> make teams and add people to them with </w:t>
+      </w:r>
+      <w:r>
+        <w:rPr>
+          <w:b/>
+        </w:rPr>
+        <w:t>+ Add person</w:t>
+      </w:r>
+      <w:r>
+        <w:rPr>
+          <w:b w:val="0"/>
+        </w:rPr>
+        <w:t>.</w:t>
       </w:r>
     </w:p>
     <w:p>
@@ -1140,7 +1250,7 @@
         <w:rPr>
           <w:b w:val="0"/>
         </w:rPr>
-        <w:t xml:space="preserve"> section: pick a manager and give them people from your own list.</w:t>
+        <w:t xml:space="preserve"> section: pick a manager and give them everyone you can see, whole teams, or single people.</w:t>
       </w:r>
     </w:p>
     <w:p>
@@ -1617,6 +1727,21 @@
         <w:rPr>
           <w:b w:val="0"/>
         </w:rPr>
+        <w:t xml:space="preserve">, </w:t>
+      </w:r>
+      <w:r>
+        <w:rPr>
+          <w:rFonts w:ascii="Consolas" w:hAnsi="Consolas"/>
+          <w:b w:val="0"/>
+          <w:color w:val="1E5FC0"/>
+          <w:sz w:val="19"/>
+        </w:rPr>
+        <w:t>015_org_policies.sql</w:t>
+      </w:r>
+      <w:r>
+        <w:rPr>
+          <w:b w:val="0"/>
+        </w:rPr>
         <w:t xml:space="preserve"> and </w:t>
       </w:r>
       <w:r>
@@ -1626,7 +1751,7 @@
           <w:color w:val="1E5FC0"/>
           <w:sz w:val="19"/>
         </w:rPr>
-        <w:t>015_org_policies.sql</w:t>
+        <w:t>017_access_groups.sql</w:t>
       </w:r>
       <w:r>
         <w:rPr>
@@ -1672,7 +1797,7 @@
         <w:rPr>
           <w:b/>
         </w:rPr>
-        <w:t>All 47 checks pass.</w:t>
+        <w:t>All 62 checks pass.</w:t>
       </w:r>
       <w:r>
         <w:rPr>
@@ -1786,7 +1911,7 @@
         <w:rPr>
           <w:b w:val="0"/>
         </w:rPr>
-        <w:t>The privacy test passed all 47 checks again after launch.</w:t>
+        <w:t>The privacy test passes all 62 checks (including Everyone, Teams and Exceptions).</w:t>
       </w:r>
     </w:p>
     <w:p>
@@ -1828,7 +1953,19 @@
         <w:rPr>
           <w:b w:val="0"/>
         </w:rPr>
-        <w:t xml:space="preserve">In </w:t>
+        <w:t xml:space="preserve">Make </w:t>
+      </w:r>
+      <w:r>
+        <w:rPr>
+          <w:b/>
+        </w:rPr>
+        <w:t>Teams</w:t>
+      </w:r>
+      <w:r>
+        <w:rPr>
+          <w:b w:val="0"/>
+        </w:rPr>
+        <w:t xml:space="preserve">, then in </w:t>
       </w:r>
       <w:r>
         <w:rPr>
@@ -1840,7 +1977,7 @@
         <w:rPr>
           <w:b w:val="0"/>
         </w:rPr>
-        <w:t>, give each founder their people.</w:t>
+        <w:t xml:space="preserve"> give each founder Everyone, their teams, or exceptions.</w:t>
       </w:r>
     </w:p>
     <w:p>
@@ -2671,7 +2808,22 @@
               <w:rPr>
                 <w:b w:val="0"/>
               </w:rPr>
-              <w:t>Who can see whom: viewer, person, level (</w:t>
+              <w:t>Person exceptions: viewer, person, level (</w:t>
+            </w:r>
+            <w:r>
+              <w:rPr>
+                <w:rFonts w:ascii="Consolas" w:hAnsi="Consolas"/>
+                <w:b w:val="0"/>
+                <w:color w:val="1E5FC0"/>
+                <w:sz w:val="19"/>
+              </w:rPr>
+              <w:t>none</w:t>
+            </w:r>
+            <w:r>
+              <w:rPr>
+                <w:b w:val="0"/>
+              </w:rPr>
+              <w:t xml:space="preserve"> / </w:t>
             </w:r>
             <w:r>
               <w:rPr>
@@ -2715,7 +2867,163 @@
               <w:rPr>
                 <w:b w:val="0"/>
               </w:rPr>
-              <w:t>The viewer, the person, the admin, and founders for their own people</w:t>
+              <w:t>The viewer, the person, the admin, founders</w:t>
+            </w:r>
+          </w:p>
+        </w:tc>
+      </w:tr>
+      <w:tr>
+        <w:tc>
+          <w:tcPr>
+            <w:tcW w:type="dxa" w:w="3249"/>
+          </w:tcPr>
+          <w:p>
+            <w:r/>
+            <w:r>
+              <w:rPr>
+                <w:rFonts w:ascii="Consolas" w:hAnsi="Consolas"/>
+                <w:b/>
+                <w:color w:val="1E5FC0"/>
+                <w:sz w:val="19"/>
+              </w:rPr>
+              <w:t>viewer_scope</w:t>
+            </w:r>
+          </w:p>
+        </w:tc>
+        <w:tc>
+          <w:tcPr>
+            <w:tcW w:type="dxa" w:w="3249"/>
+          </w:tcPr>
+          <w:p>
+            <w:r/>
+            <w:r>
+              <w:rPr>
+                <w:b w:val="0"/>
+              </w:rPr>
+              <w:t>"Everyone" for a viewer, at view or plan</w:t>
+            </w:r>
+          </w:p>
+        </w:tc>
+        <w:tc>
+          <w:tcPr>
+            <w:tcW w:type="dxa" w:w="3249"/>
+          </w:tcPr>
+          <w:p>
+            <w:r/>
+            <w:r>
+              <w:rPr>
+                <w:b w:val="0"/>
+              </w:rPr>
+              <w:t>The viewer, the admin, founders</w:t>
+            </w:r>
+          </w:p>
+        </w:tc>
+      </w:tr>
+      <w:tr>
+        <w:tc>
+          <w:tcPr>
+            <w:tcW w:type="dxa" w:w="3249"/>
+          </w:tcPr>
+          <w:p>
+            <w:r/>
+            <w:r>
+              <w:rPr>
+                <w:rFonts w:ascii="Consolas" w:hAnsi="Consolas"/>
+                <w:b/>
+                <w:color w:val="1E5FC0"/>
+                <w:sz w:val="19"/>
+              </w:rPr>
+              <w:t>teams</w:t>
+            </w:r>
+            <w:r>
+              <w:rPr>
+                <w:b/>
+              </w:rPr>
+              <w:t xml:space="preserve">, </w:t>
+            </w:r>
+            <w:r>
+              <w:rPr>
+                <w:rFonts w:ascii="Consolas" w:hAnsi="Consolas"/>
+                <w:b/>
+                <w:color w:val="1E5FC0"/>
+                <w:sz w:val="19"/>
+              </w:rPr>
+              <w:t>team_members</w:t>
+            </w:r>
+          </w:p>
+        </w:tc>
+        <w:tc>
+          <w:tcPr>
+            <w:tcW w:type="dxa" w:w="3249"/>
+          </w:tcPr>
+          <w:p>
+            <w:r/>
+            <w:r>
+              <w:rPr>
+                <w:b w:val="0"/>
+              </w:rPr>
+              <w:t>Teams and who is in them</w:t>
+            </w:r>
+          </w:p>
+        </w:tc>
+        <w:tc>
+          <w:tcPr>
+            <w:tcW w:type="dxa" w:w="3249"/>
+          </w:tcPr>
+          <w:p>
+            <w:r/>
+            <w:r>
+              <w:rPr>
+                <w:b w:val="0"/>
+              </w:rPr>
+              <w:t>All signed-in people</w:t>
+            </w:r>
+          </w:p>
+        </w:tc>
+      </w:tr>
+      <w:tr>
+        <w:tc>
+          <w:tcPr>
+            <w:tcW w:type="dxa" w:w="3249"/>
+          </w:tcPr>
+          <w:p>
+            <w:r/>
+            <w:r>
+              <w:rPr>
+                <w:rFonts w:ascii="Consolas" w:hAnsi="Consolas"/>
+                <w:b/>
+                <w:color w:val="1E5FC0"/>
+                <w:sz w:val="19"/>
+              </w:rPr>
+              <w:t>team_access</w:t>
+            </w:r>
+          </w:p>
+        </w:tc>
+        <w:tc>
+          <w:tcPr>
+            <w:tcW w:type="dxa" w:w="3249"/>
+          </w:tcPr>
+          <w:p>
+            <w:r/>
+            <w:r>
+              <w:rPr>
+                <w:b w:val="0"/>
+              </w:rPr>
+              <w:t>A viewer's level on a whole team</w:t>
+            </w:r>
+          </w:p>
+        </w:tc>
+        <w:tc>
+          <w:tcPr>
+            <w:tcW w:type="dxa" w:w="3249"/>
+          </w:tcPr>
+          <w:p>
+            <w:r/>
+            <w:r>
+              <w:rPr>
+                <w:b w:val="0"/>
+              </w:rPr>
+              <w:t>The viewer, the admin, founders</w:t>
             </w:r>
           </w:p>
         </w:tc>
@@ -2856,7 +3164,22 @@
         <w:rPr>
           <w:b w:val="0"/>
         </w:rPr>
-        <w:t xml:space="preserve"> true if it's you, if you're an active admin, or if an </w:t>
+        <w:t xml:space="preserve"> uses </w:t>
+      </w:r>
+      <w:r>
+        <w:rPr>
+          <w:rFonts w:ascii="Consolas" w:hAnsi="Consolas"/>
+          <w:b w:val="0"/>
+          <w:color w:val="1E5FC0"/>
+          <w:sz w:val="19"/>
+        </w:rPr>
+        <w:t>access_level(viewer, person)</w:t>
+      </w:r>
+      <w:r>
+        <w:rPr>
+          <w:b w:val="0"/>
+        </w:rPr>
+        <w:t xml:space="preserve"> (0 none, 1 view, 2 plan). It is 2 for yourself and for an active admin. Otherwise the most specific rule wins: a person exception (</w:t>
       </w:r>
       <w:r>
         <w:rPr>
@@ -2871,7 +3194,69 @@
         <w:rPr>
           <w:b w:val="0"/>
         </w:rPr>
-        <w:t xml:space="preserve"> row gives you that person at that level (Plan includes View).</w:t>
+        <w:t>), then the best team (</w:t>
+      </w:r>
+      <w:r>
+        <w:rPr>
+          <w:rFonts w:ascii="Consolas" w:hAnsi="Consolas"/>
+          <w:b w:val="0"/>
+          <w:color w:val="1E5FC0"/>
+          <w:sz w:val="19"/>
+        </w:rPr>
+        <w:t>team_access</w:t>
+      </w:r>
+      <w:r>
+        <w:rPr>
+          <w:b w:val="0"/>
+        </w:rPr>
+        <w:t>), then Everyone (</w:t>
+      </w:r>
+      <w:r>
+        <w:rPr>
+          <w:rFonts w:ascii="Consolas" w:hAnsi="Consolas"/>
+          <w:b w:val="0"/>
+          <w:color w:val="1E5FC0"/>
+          <w:sz w:val="19"/>
+        </w:rPr>
+        <w:t>viewer_scope</w:t>
+      </w:r>
+      <w:r>
+        <w:rPr>
+          <w:b w:val="0"/>
+        </w:rPr>
+        <w:t>, which never includes an admin).</w:t>
+      </w:r>
+    </w:p>
+    <w:p>
+      <w:pPr>
+        <w:pStyle w:val="ListBullet"/>
+      </w:pPr>
+      <w:r>
+        <w:rPr>
+          <w:b/>
+        </w:rPr>
+        <w:t>Rules can't over-share:</w:t>
+      </w:r>
+      <w:r>
+        <w:rPr>
+          <w:b w:val="0"/>
+        </w:rPr>
+        <w:t xml:space="preserve"> every rule is capped by what its setter can see (</w:t>
+      </w:r>
+      <w:r>
+        <w:rPr>
+          <w:rFonts w:ascii="Consolas" w:hAnsi="Consolas"/>
+          <w:b w:val="0"/>
+          <w:color w:val="1E5FC0"/>
+          <w:sz w:val="19"/>
+        </w:rPr>
+        <w:t>grant_cap</w:t>
+      </w:r>
+      <w:r>
+        <w:rPr>
+          <w:b w:val="0"/>
+        </w:rPr>
+        <w:t>). A founder's "Everyone at Plan" for a manager only reaches people the founder can see, at the founder's own level. Rules set by a founder who loses the role or leaves stop working by themselves.</w:t>
       </w:r>
     </w:p>
     <w:p>
@@ -3079,7 +3464,122 @@
         <w:rPr>
           <w:b w:val="0"/>
         </w:rPr>
-        <w:t>: the admin can give anyone access to anyone. A founder can only give managers people the founder can see, and no higher than the founder's own level.</w:t>
+        <w:t xml:space="preserve"> (person exception), </w:t>
+      </w:r>
+      <w:r>
+        <w:rPr>
+          <w:rFonts w:ascii="Consolas" w:hAnsi="Consolas"/>
+          <w:b w:val="0"/>
+          <w:color w:val="1E5FC0"/>
+          <w:sz w:val="19"/>
+        </w:rPr>
+        <w:t>org_set_scope</w:t>
+      </w:r>
+      <w:r>
+        <w:rPr>
+          <w:b w:val="0"/>
+        </w:rPr>
+        <w:t xml:space="preserve"> (Everyone) and </w:t>
+      </w:r>
+      <w:r>
+        <w:rPr>
+          <w:rFonts w:ascii="Consolas" w:hAnsi="Consolas"/>
+          <w:b w:val="0"/>
+          <w:color w:val="1E5FC0"/>
+          <w:sz w:val="19"/>
+        </w:rPr>
+        <w:t>org_set_team_access</w:t>
+      </w:r>
+      <w:r>
+        <w:rPr>
+          <w:b w:val="0"/>
+        </w:rPr>
+        <w:t xml:space="preserve"> (team): the admin can set them for anyone. A founder can only set them for managers.</w:t>
+      </w:r>
+    </w:p>
+    <w:p>
+      <w:pPr>
+        <w:pStyle w:val="ListBullet2"/>
+      </w:pPr>
+      <w:r>
+        <w:rPr>
+          <w:rFonts w:ascii="Consolas" w:hAnsi="Consolas"/>
+          <w:b w:val="0"/>
+          <w:color w:val="1E5FC0"/>
+          <w:sz w:val="19"/>
+        </w:rPr>
+        <w:t>org_save_team</w:t>
+      </w:r>
+      <w:r>
+        <w:rPr>
+          <w:b w:val="0"/>
+        </w:rPr>
+        <w:t xml:space="preserve">, </w:t>
+      </w:r>
+      <w:r>
+        <w:rPr>
+          <w:rFonts w:ascii="Consolas" w:hAnsi="Consolas"/>
+          <w:b w:val="0"/>
+          <w:color w:val="1E5FC0"/>
+          <w:sz w:val="19"/>
+        </w:rPr>
+        <w:t>org_delete_team</w:t>
+      </w:r>
+      <w:r>
+        <w:rPr>
+          <w:b w:val="0"/>
+        </w:rPr>
+        <w:t xml:space="preserve">, </w:t>
+      </w:r>
+      <w:r>
+        <w:rPr>
+          <w:rFonts w:ascii="Consolas" w:hAnsi="Consolas"/>
+          <w:b w:val="0"/>
+          <w:color w:val="1E5FC0"/>
+          <w:sz w:val="19"/>
+        </w:rPr>
+        <w:t>org_set_team_member</w:t>
+      </w:r>
+      <w:r>
+        <w:rPr>
+          <w:b w:val="0"/>
+        </w:rPr>
+        <w:t>: admin only.</w:t>
+      </w:r>
+    </w:p>
+    <w:p>
+      <w:pPr>
+        <w:pStyle w:val="ListBullet2"/>
+      </w:pPr>
+      <w:r>
+        <w:rPr>
+          <w:rFonts w:ascii="Consolas" w:hAnsi="Consolas"/>
+          <w:b w:val="0"/>
+          <w:color w:val="1E5FC0"/>
+          <w:sz w:val="19"/>
+        </w:rPr>
+        <w:t>org_my_people</w:t>
+      </w:r>
+      <w:r>
+        <w:rPr>
+          <w:b w:val="0"/>
+        </w:rPr>
+        <w:t xml:space="preserve"> / </w:t>
+      </w:r>
+      <w:r>
+        <w:rPr>
+          <w:rFonts w:ascii="Consolas" w:hAnsi="Consolas"/>
+          <w:b w:val="0"/>
+          <w:color w:val="1E5FC0"/>
+          <w:sz w:val="19"/>
+        </w:rPr>
+        <w:t>org_people_of</w:t>
+      </w:r>
+      <w:r>
+        <w:rPr>
+          <w:b w:val="0"/>
+        </w:rPr>
+        <w:t>: who you, or a given viewer, end up seeing (for the Team page and the access summary).</w:t>
       </w:r>
     </w:p>
     <w:p>
@@ -3520,6 +4020,39 @@
                 <w:color w:val="1E5FC0"/>
                 <w:sz w:val="19"/>
               </w:rPr>
+              <w:t>supabase/migrations/017_access_groups.sql</w:t>
+            </w:r>
+          </w:p>
+        </w:tc>
+        <w:tc>
+          <w:tcPr>
+            <w:tcW w:type="dxa" w:w="4873"/>
+          </w:tcPr>
+          <w:p>
+            <w:r/>
+            <w:r>
+              <w:rPr>
+                <w:b w:val="0"/>
+              </w:rPr>
+              <w:t>Everyone, Teams, exceptions and the resolver</w:t>
+            </w:r>
+          </w:p>
+        </w:tc>
+      </w:tr>
+      <w:tr>
+        <w:tc>
+          <w:tcPr>
+            <w:tcW w:type="dxa" w:w="4873"/>
+          </w:tcPr>
+          <w:p>
+            <w:r/>
+            <w:r>
+              <w:rPr>
+                <w:rFonts w:ascii="Consolas" w:hAnsi="Consolas"/>
+                <w:b/>
+                <w:color w:val="1E5FC0"/>
+                <w:sz w:val="19"/>
+              </w:rPr>
               <w:t>supabase/tests/org_privacy_test.sql</w:t>
             </w:r>
           </w:p>
@@ -3534,7 +4067,7 @@
               <w:rPr>
                 <w:b w:val="0"/>
               </w:rPr>
-              <w:t>Automated privacy test (47 checks; everything rolled back)</w:t>
+              <w:t>Automated privacy test (62 checks; everything rolled back)</w:t>
             </w:r>
           </w:p>
         </w:tc>
@@ -3795,6 +4328,21 @@
               </w:rPr>
               <w:t>src/components/AccessEditor.tsx</w:t>
             </w:r>
+            <w:r>
+              <w:rPr>
+                <w:b/>
+              </w:rPr>
+              <w:t xml:space="preserve">, </w:t>
+            </w:r>
+            <w:r>
+              <w:rPr>
+                <w:rFonts w:ascii="Consolas" w:hAnsi="Consolas"/>
+                <w:b/>
+                <w:color w:val="1E5FC0"/>
+                <w:sz w:val="19"/>
+              </w:rPr>
+              <w:t>TeamsEditor.tsx</w:t>
+            </w:r>
           </w:p>
         </w:tc>
         <w:tc>
@@ -3807,7 +4355,7 @@
               <w:rPr>
                 <w:b w:val="0"/>
               </w:rPr>
-              <w:t>The None / View / Plan picker</w:t>
+              <w:t>Who sees whom (Everyone, Teams, Exceptions) and the teams themselves</w:t>
             </w:r>
           </w:p>
         </w:tc>

</xml_diff>